<commit_message>
Update documentation with bug fixes
</commit_message>
<xml_diff>
--- a/eSocial_Extractor_Documentacao_PTBR.docx
+++ b/eSocial_Extractor_Documentacao_PTBR.docx
@@ -2593,6 +2593,14 @@
     <w:p>
       <w:r>
         <w:t>Correções de Bugs: Veja BUG_FIXES_REPORT.md</w:t>
+      </w:r>
+    </w:p>
+    <w:p>
+      <w:r>
+        <w:br/>
+        <w:t>📋 Última Atualização: 29/01/2026 11:12:08</w:t>
+        <w:br/>
+        <w:t>🔗 Commit Mais Recente: N/A</w:t>
       </w:r>
     </w:p>
     <w:sectPr>

</xml_diff>